<commit_message>
mainly scientific literature about excitonic physics added during preparation
</commit_message>
<xml_diff>
--- a/Forschungsfrage entwickeln - PhD Moiré materials Bester.docx
+++ b/Forschungsfrage entwickeln - PhD Moiré materials Bester.docx
@@ -289,6 +289,250 @@
       <w:proofErr w:type="spellEnd"/>
       <w:r>
         <w:t xml:space="preserve">? </w:t>
+      </w:r>
+    </w:p>
+    <w:p/>
+    <w:p>
+      <w:r>
+        <w:t xml:space="preserve">Strategie: Read </w:t>
+      </w:r>
+      <w:proofErr w:type="spellStart"/>
+      <w:r>
+        <w:t>dissertation</w:t>
+      </w:r>
+      <w:proofErr w:type="spellEnd"/>
+      <w:r>
+        <w:t xml:space="preserve"> „</w:t>
+      </w:r>
+      <w:proofErr w:type="spellStart"/>
+      <w:r>
+        <w:t>Exzitons</w:t>
+      </w:r>
+      <w:proofErr w:type="spellEnd"/>
+      <w:r>
+        <w:t xml:space="preserve"> in mono and </w:t>
+      </w:r>
+      <w:proofErr w:type="spellStart"/>
+      <w:r>
+        <w:t>bilayers</w:t>
+      </w:r>
+      <w:proofErr w:type="spellEnd"/>
+      <w:r>
+        <w:t xml:space="preserve"> of TMDs“ </w:t>
+      </w:r>
+      <w:proofErr w:type="spellStart"/>
+      <w:r>
+        <w:t>from</w:t>
+      </w:r>
+      <w:proofErr w:type="spellEnd"/>
+      <w:r>
+        <w:t xml:space="preserve"> Malte Kremser (TUM) and </w:t>
+      </w:r>
+      <w:proofErr w:type="spellStart"/>
+      <w:r>
+        <w:t>search</w:t>
+      </w:r>
+      <w:proofErr w:type="spellEnd"/>
+      <w:r>
+        <w:t xml:space="preserve"> for open </w:t>
+      </w:r>
+      <w:proofErr w:type="spellStart"/>
+      <w:r>
+        <w:t>scientific</w:t>
+      </w:r>
+      <w:proofErr w:type="spellEnd"/>
+      <w:r>
+        <w:t xml:space="preserve"> </w:t>
+      </w:r>
+      <w:proofErr w:type="spellStart"/>
+      <w:r>
+        <w:t>questions</w:t>
+      </w:r>
+      <w:proofErr w:type="spellEnd"/>
+      <w:r>
+        <w:t xml:space="preserve"> and </w:t>
+      </w:r>
+      <w:proofErr w:type="spellStart"/>
+      <w:r>
+        <w:t>what</w:t>
+      </w:r>
+      <w:proofErr w:type="spellEnd"/>
+      <w:r>
+        <w:t xml:space="preserve"> he </w:t>
+      </w:r>
+      <w:proofErr w:type="spellStart"/>
+      <w:r>
+        <w:t>researched</w:t>
+      </w:r>
+      <w:proofErr w:type="spellEnd"/>
+      <w:r>
+        <w:t xml:space="preserve"> </w:t>
+      </w:r>
+      <w:proofErr w:type="spellStart"/>
+      <w:r>
+        <w:t>about</w:t>
+      </w:r>
+      <w:proofErr w:type="spellEnd"/>
+      <w:r>
+        <w:t xml:space="preserve"> Moiré </w:t>
+      </w:r>
+      <w:proofErr w:type="spellStart"/>
+      <w:proofErr w:type="gramStart"/>
+      <w:r>
+        <w:t>exzitons</w:t>
+      </w:r>
+      <w:proofErr w:type="spellEnd"/>
+      <w:r>
+        <w:t xml:space="preserve">;  </w:t>
+      </w:r>
+      <w:r>
+        <w:t>And</w:t>
+      </w:r>
+      <w:proofErr w:type="gramEnd"/>
+      <w:r>
+        <w:t xml:space="preserve"> also </w:t>
+      </w:r>
+      <w:proofErr w:type="spellStart"/>
+      <w:r>
+        <w:t>read</w:t>
+      </w:r>
+      <w:proofErr w:type="spellEnd"/>
+      <w:r>
+        <w:t xml:space="preserve"> and </w:t>
+      </w:r>
+      <w:proofErr w:type="spellStart"/>
+      <w:r>
+        <w:t>understand</w:t>
+      </w:r>
+      <w:proofErr w:type="spellEnd"/>
+      <w:r>
+        <w:t xml:space="preserve"> in </w:t>
+      </w:r>
+      <w:proofErr w:type="spellStart"/>
+      <w:r>
+        <w:t>detail</w:t>
+      </w:r>
+      <w:proofErr w:type="spellEnd"/>
+      <w:r>
+        <w:t xml:space="preserve"> </w:t>
+      </w:r>
+      <w:proofErr w:type="spellStart"/>
+      <w:r>
+        <w:t>his</w:t>
+      </w:r>
+      <w:proofErr w:type="spellEnd"/>
+      <w:r>
+        <w:t xml:space="preserve"> </w:t>
+      </w:r>
+      <w:proofErr w:type="spellStart"/>
+      <w:r>
+        <w:t>paper</w:t>
+      </w:r>
+      <w:proofErr w:type="spellEnd"/>
+      <w:r>
+        <w:t xml:space="preserve">: </w:t>
+      </w:r>
+      <w:r>
+        <w:t>Twist-</w:t>
+      </w:r>
+      <w:proofErr w:type="spellStart"/>
+      <w:r>
+        <w:t>Dependent</w:t>
+      </w:r>
+      <w:proofErr w:type="spellEnd"/>
+      <w:r>
+        <w:t xml:space="preserve"> Intra- and </w:t>
+      </w:r>
+      <w:proofErr w:type="spellStart"/>
+      <w:r>
+        <w:t>Interlayer</w:t>
+      </w:r>
+      <w:proofErr w:type="spellEnd"/>
+      <w:r>
+        <w:t xml:space="preserve"> </w:t>
+      </w:r>
+      <w:proofErr w:type="spellStart"/>
+      <w:r>
+        <w:t>Excitons</w:t>
+      </w:r>
+      <w:proofErr w:type="spellEnd"/>
+      <w:r>
+        <w:t xml:space="preserve"> in </w:t>
+      </w:r>
+      <w:proofErr w:type="spellStart"/>
+      <w:r>
+        <w:t>Moir´e</w:t>
+      </w:r>
+      <w:proofErr w:type="spellEnd"/>
+      <w:r>
+        <w:t xml:space="preserve"> MoSe2 </w:t>
+      </w:r>
+      <w:proofErr w:type="spellStart"/>
+      <w:r>
+        <w:t>Homobilayers</w:t>
+      </w:r>
+      <w:proofErr w:type="spellEnd"/>
+      <w:r>
+        <w:t>;</w:t>
+      </w:r>
+      <w:r>
+        <w:t xml:space="preserve"> </w:t>
+      </w:r>
+      <w:proofErr w:type="spellStart"/>
+      <w:r>
+        <w:t>Answer</w:t>
+      </w:r>
+      <w:proofErr w:type="spellEnd"/>
+      <w:r>
+        <w:t xml:space="preserve"> the 4 </w:t>
+      </w:r>
+      <w:proofErr w:type="spellStart"/>
+      <w:r>
+        <w:t>questions</w:t>
+      </w:r>
+      <w:proofErr w:type="spellEnd"/>
+      <w:r>
+        <w:t xml:space="preserve"> </w:t>
+      </w:r>
+      <w:proofErr w:type="spellStart"/>
+      <w:r>
+        <w:t>above</w:t>
+      </w:r>
+      <w:proofErr w:type="spellEnd"/>
+      <w:r>
+        <w:t xml:space="preserve"> for </w:t>
+      </w:r>
+      <w:proofErr w:type="spellStart"/>
+      <w:r>
+        <w:t>these</w:t>
+      </w:r>
+      <w:proofErr w:type="spellEnd"/>
+      <w:r>
+        <w:t xml:space="preserve"> </w:t>
+      </w:r>
+      <w:proofErr w:type="spellStart"/>
+      <w:r>
+        <w:t>papers</w:t>
+      </w:r>
+      <w:proofErr w:type="spellEnd"/>
+      <w:r>
+        <w:t xml:space="preserve"> and </w:t>
+      </w:r>
+      <w:proofErr w:type="spellStart"/>
+      <w:r>
+        <w:t>dissertations</w:t>
+      </w:r>
+      <w:proofErr w:type="spellEnd"/>
+      <w:r>
+        <w:t xml:space="preserve">. </w:t>
+      </w:r>
+      <w:r>
+        <w:t xml:space="preserve"> </w:t>
+      </w:r>
+    </w:p>
+    <w:p>
+      <w:r>
+        <w:t xml:space="preserve">Read also </w:t>
       </w:r>
     </w:p>
     <w:p>
@@ -913,7 +1157,6 @@
   <w:style w:type="character" w:default="1" w:styleId="Absatz-Standardschriftart">
     <w:name w:val="Default Paragraph Font"/>
     <w:uiPriority w:val="1"/>
-    <w:semiHidden/>
     <w:unhideWhenUsed/>
   </w:style>
   <w:style w:type="table" w:default="1" w:styleId="NormaleTabelle">

</xml_diff>

<commit_message>
programming cheat sheat expanded; last commit before real PhD start
</commit_message>
<xml_diff>
--- a/Forschungsfrage entwickeln - PhD Moiré materials Bester.docx
+++ b/Forschungsfrage entwickeln - PhD Moiré materials Bester.docx
@@ -532,9 +532,172 @@
     </w:p>
     <w:p>
       <w:r>
-        <w:t xml:space="preserve">Read also </w:t>
+        <w:t xml:space="preserve">Mein Arbeitstitel von meinem Einstellungsvertrag heißt ja: „Novel Ab Initio </w:t>
+      </w:r>
+      <w:proofErr w:type="spellStart"/>
+      <w:r>
+        <w:t>Methodology</w:t>
+      </w:r>
+      <w:proofErr w:type="spellEnd"/>
+      <w:r>
+        <w:t xml:space="preserve"> for Trions and </w:t>
+      </w:r>
+      <w:proofErr w:type="spellStart"/>
+      <w:r>
+        <w:t>Biexcitons</w:t>
+      </w:r>
+      <w:proofErr w:type="spellEnd"/>
+      <w:r>
+        <w:t xml:space="preserve"> in Moiré and 2D Janus </w:t>
+      </w:r>
+      <w:proofErr w:type="spellStart"/>
+      <w:r>
+        <w:t>materials</w:t>
+      </w:r>
+      <w:proofErr w:type="spellEnd"/>
+      <w:r>
+        <w:t xml:space="preserve">“. Habt ihr da schon konkrete Ideen, welche Art von </w:t>
+      </w:r>
+      <w:proofErr w:type="spellStart"/>
+      <w:r>
+        <w:t>Methology</w:t>
+      </w:r>
+      <w:proofErr w:type="spellEnd"/>
+      <w:r>
+        <w:t xml:space="preserve"> ich und wir für diese entwickeln wollen? Und welche in anderen 2D Systemen und </w:t>
+      </w:r>
+      <w:proofErr w:type="spellStart"/>
+      <w:r>
+        <w:t>mglw</w:t>
+      </w:r>
+      <w:proofErr w:type="spellEnd"/>
+      <w:r>
+        <w:t xml:space="preserve">. </w:t>
+      </w:r>
+      <w:proofErr w:type="spellStart"/>
+      <w:r>
+        <w:t>Exzitonenarten</w:t>
+      </w:r>
+      <w:proofErr w:type="spellEnd"/>
+      <w:r>
+        <w:t xml:space="preserve"> schon gut funktioniert hat, aber für Trions and </w:t>
+      </w:r>
+      <w:proofErr w:type="spellStart"/>
+      <w:r>
+        <w:t>Biexcitons</w:t>
+      </w:r>
+      <w:proofErr w:type="spellEnd"/>
+      <w:r>
+        <w:t xml:space="preserve"> in Moiré und Janus 2D </w:t>
+      </w:r>
+      <w:proofErr w:type="spellStart"/>
+      <w:r>
+        <w:t>materials</w:t>
+      </w:r>
+      <w:proofErr w:type="spellEnd"/>
+      <w:r>
+        <w:t xml:space="preserve"> noch nicht angewandt wurde? </w:t>
       </w:r>
     </w:p>
+    <w:p>
+      <w:r>
+        <w:t xml:space="preserve">Im </w:t>
+      </w:r>
+      <w:proofErr w:type="spellStart"/>
+      <w:r>
+        <w:t>paper</w:t>
+      </w:r>
+      <w:proofErr w:type="spellEnd"/>
+      <w:r>
+        <w:t xml:space="preserve"> </w:t>
+      </w:r>
+      <w:r>
+        <w:t xml:space="preserve">„Real time </w:t>
+      </w:r>
+      <w:proofErr w:type="spellStart"/>
+      <w:r>
+        <w:t>exciton</w:t>
+      </w:r>
+      <w:proofErr w:type="spellEnd"/>
+      <w:r>
+        <w:t xml:space="preserve"> </w:t>
+      </w:r>
+      <w:proofErr w:type="spellStart"/>
+      <w:r>
+        <w:t>dynamics</w:t>
+      </w:r>
+      <w:proofErr w:type="spellEnd"/>
+      <w:r>
+        <w:t xml:space="preserve"> in 2D </w:t>
+      </w:r>
+      <w:proofErr w:type="spellStart"/>
+      <w:r>
+        <w:t>materials</w:t>
+      </w:r>
+      <w:proofErr w:type="spellEnd"/>
+      <w:r>
+        <w:t xml:space="preserve"> </w:t>
+      </w:r>
+      <w:proofErr w:type="spellStart"/>
+      <w:r>
+        <w:t>under</w:t>
+      </w:r>
+      <w:proofErr w:type="spellEnd"/>
+      <w:r>
+        <w:t xml:space="preserve"> </w:t>
+      </w:r>
+      <w:proofErr w:type="spellStart"/>
+      <w:r>
+        <w:t>ultrashort</w:t>
+      </w:r>
+      <w:proofErr w:type="spellEnd"/>
+      <w:r>
+        <w:t xml:space="preserve"> </w:t>
+      </w:r>
+      <w:proofErr w:type="spellStart"/>
+      <w:r>
+        <w:t>laser</w:t>
+      </w:r>
+      <w:proofErr w:type="spellEnd"/>
+      <w:r>
+        <w:t xml:space="preserve"> </w:t>
+      </w:r>
+      <w:proofErr w:type="spellStart"/>
+      <w:r>
+        <w:t>pulses</w:t>
+      </w:r>
+      <w:proofErr w:type="spellEnd"/>
+      <w:r>
+        <w:t xml:space="preserve">“ von D. </w:t>
+      </w:r>
+      <w:proofErr w:type="spellStart"/>
+      <w:r>
+        <w:t>Gorelova</w:t>
+      </w:r>
+      <w:proofErr w:type="spellEnd"/>
+      <w:r>
+        <w:t xml:space="preserve"> (2026) wird auf einige genutzte </w:t>
+      </w:r>
+      <w:proofErr w:type="spellStart"/>
+      <w:r>
+        <w:t>abInitio</w:t>
+      </w:r>
+      <w:proofErr w:type="spellEnd"/>
+      <w:r>
+        <w:t xml:space="preserve"> Techniken referenziert. Dieses kannst du als Ausgangspunkt nehmen, um diese zu studieren und passende zu finden. </w:t>
+      </w:r>
+    </w:p>
+    <w:p/>
+    <w:p>
+      <w:pPr>
+        <w:rPr>
+          <w:b/>
+          <w:bCs/>
+        </w:rPr>
+      </w:pPr>
+    </w:p>
+    <w:p/>
+    <w:p/>
     <w:p>
       <w:pPr>
         <w:rPr>
@@ -1157,6 +1320,7 @@
   <w:style w:type="character" w:default="1" w:styleId="Absatz-Standardschriftart">
     <w:name w:val="Default Paragraph Font"/>
     <w:uiPriority w:val="1"/>
+    <w:semiHidden/>
     <w:unhideWhenUsed/>
   </w:style>
   <w:style w:type="table" w:default="1" w:styleId="NormaleTabelle">

</xml_diff>

<commit_message>
PhD_folder commit 25.09.26 after around 2 weeks PhD - mainly research sketch improved
</commit_message>
<xml_diff>
--- a/Forschungsfrage entwickeln - PhD Moiré materials Bester.docx
+++ b/Forschungsfrage entwickeln - PhD Moiré materials Bester.docx
@@ -294,11 +294,14 @@
     <w:p/>
     <w:p>
       <w:r>
-        <w:t xml:space="preserve">Strategie: Read </w:t>
-      </w:r>
-      <w:proofErr w:type="spellStart"/>
-      <w:r>
-        <w:t>dissertation</w:t>
+        <w:t xml:space="preserve">Strategie: </w:t>
+      </w:r>
+      <w:r>
+        <w:t xml:space="preserve">Read review </w:t>
+      </w:r>
+      <w:proofErr w:type="spellStart"/>
+      <w:r>
+        <w:t>articel</w:t>
       </w:r>
       <w:proofErr w:type="spellEnd"/>
       <w:r>
@@ -306,27 +309,43 @@
       </w:r>
       <w:proofErr w:type="spellStart"/>
       <w:r>
-        <w:t>Exzitons</w:t>
-      </w:r>
-      <w:proofErr w:type="spellEnd"/>
-      <w:r>
-        <w:t xml:space="preserve"> in mono and </w:t>
-      </w:r>
-      <w:proofErr w:type="spellStart"/>
-      <w:r>
-        <w:t>bilayers</w:t>
-      </w:r>
-      <w:proofErr w:type="spellEnd"/>
-      <w:r>
-        <w:t xml:space="preserve"> of TMDs“ </w:t>
-      </w:r>
-      <w:proofErr w:type="spellStart"/>
-      <w:r>
-        <w:t>from</w:t>
-      </w:r>
-      <w:proofErr w:type="spellEnd"/>
-      <w:r>
-        <w:t xml:space="preserve"> Malte Kremser (TUM) and </w:t>
+        <w:t>Twistronics</w:t>
+      </w:r>
+      <w:proofErr w:type="spellEnd"/>
+      <w:r>
+        <w:t xml:space="preserve"> and </w:t>
+      </w:r>
+      <w:proofErr w:type="spellStart"/>
+      <w:r>
+        <w:t>exciton</w:t>
+      </w:r>
+      <w:proofErr w:type="spellEnd"/>
+      <w:r>
+        <w:t xml:space="preserve"> </w:t>
+      </w:r>
+      <w:proofErr w:type="spellStart"/>
+      <w:r>
+        <w:t>physics</w:t>
+      </w:r>
+      <w:proofErr w:type="spellEnd"/>
+      <w:r>
+        <w:t xml:space="preserve"> in van der Waals </w:t>
+      </w:r>
+      <w:proofErr w:type="spellStart"/>
+      <w:r>
+        <w:t>heterostructures</w:t>
+      </w:r>
+      <w:proofErr w:type="spellEnd"/>
+      <w:r>
+        <w:t xml:space="preserve">“ von </w:t>
+      </w:r>
+      <w:proofErr w:type="spellStart"/>
+      <w:r>
+        <w:t>Siwei</w:t>
+      </w:r>
+      <w:proofErr w:type="spellEnd"/>
+      <w:r>
+        <w:t xml:space="preserve"> Li et al. (2024) and </w:t>
       </w:r>
       <w:proofErr w:type="spellStart"/>
       <w:r>
@@ -350,257 +369,326 @@
       </w:r>
       <w:proofErr w:type="spellEnd"/>
       <w:r>
-        <w:t xml:space="preserve"> and </w:t>
-      </w:r>
-      <w:proofErr w:type="spellStart"/>
-      <w:r>
-        <w:t>what</w:t>
-      </w:r>
-      <w:proofErr w:type="spellEnd"/>
-      <w:r>
-        <w:t xml:space="preserve"> he </w:t>
-      </w:r>
-      <w:proofErr w:type="spellStart"/>
-      <w:r>
-        <w:t>researched</w:t>
-      </w:r>
-      <w:proofErr w:type="spellEnd"/>
-      <w:r>
-        <w:t xml:space="preserve"> </w:t>
-      </w:r>
-      <w:proofErr w:type="spellStart"/>
-      <w:r>
-        <w:t>about</w:t>
-      </w:r>
-      <w:proofErr w:type="spellEnd"/>
-      <w:r>
-        <w:t xml:space="preserve"> Moiré </w:t>
-      </w:r>
-      <w:proofErr w:type="spellStart"/>
-      <w:proofErr w:type="gramStart"/>
-      <w:r>
-        <w:t>exzitons</w:t>
-      </w:r>
-      <w:proofErr w:type="spellEnd"/>
-      <w:r>
-        <w:t xml:space="preserve">;  </w:t>
-      </w:r>
-      <w:r>
-        <w:t>And</w:t>
-      </w:r>
-      <w:proofErr w:type="gramEnd"/>
-      <w:r>
-        <w:t xml:space="preserve"> also </w:t>
-      </w:r>
-      <w:proofErr w:type="spellStart"/>
-      <w:r>
-        <w:t>read</w:t>
-      </w:r>
-      <w:proofErr w:type="spellEnd"/>
-      <w:r>
-        <w:t xml:space="preserve"> and </w:t>
-      </w:r>
-      <w:proofErr w:type="spellStart"/>
-      <w:r>
-        <w:t>understand</w:t>
-      </w:r>
-      <w:proofErr w:type="spellEnd"/>
-      <w:r>
-        <w:t xml:space="preserve"> in </w:t>
-      </w:r>
-      <w:proofErr w:type="spellStart"/>
-      <w:r>
-        <w:t>detail</w:t>
-      </w:r>
-      <w:proofErr w:type="spellEnd"/>
-      <w:r>
-        <w:t xml:space="preserve"> </w:t>
-      </w:r>
-      <w:proofErr w:type="spellStart"/>
-      <w:r>
-        <w:t>his</w:t>
-      </w:r>
-      <w:proofErr w:type="spellEnd"/>
-      <w:r>
-        <w:t xml:space="preserve"> </w:t>
-      </w:r>
-      <w:proofErr w:type="spellStart"/>
-      <w:r>
-        <w:t>paper</w:t>
-      </w:r>
-      <w:proofErr w:type="spellEnd"/>
-      <w:r>
-        <w:t xml:space="preserve">: </w:t>
-      </w:r>
-      <w:r>
-        <w:t>Twist-</w:t>
-      </w:r>
-      <w:proofErr w:type="spellStart"/>
-      <w:r>
-        <w:t>Dependent</w:t>
-      </w:r>
-      <w:proofErr w:type="spellEnd"/>
-      <w:r>
-        <w:t xml:space="preserve"> Intra- and </w:t>
-      </w:r>
-      <w:proofErr w:type="spellStart"/>
-      <w:r>
-        <w:t>Interlayer</w:t>
-      </w:r>
-      <w:proofErr w:type="spellEnd"/>
-      <w:r>
-        <w:t xml:space="preserve"> </w:t>
-      </w:r>
-      <w:proofErr w:type="spellStart"/>
-      <w:r>
-        <w:t>Excitons</w:t>
-      </w:r>
-      <w:proofErr w:type="spellEnd"/>
-      <w:r>
-        <w:t xml:space="preserve"> in </w:t>
-      </w:r>
-      <w:proofErr w:type="spellStart"/>
-      <w:r>
-        <w:t>Moir´e</w:t>
-      </w:r>
-      <w:proofErr w:type="spellEnd"/>
-      <w:r>
-        <w:t xml:space="preserve"> MoSe2 </w:t>
-      </w:r>
-      <w:proofErr w:type="spellStart"/>
-      <w:r>
-        <w:t>Homobilayers</w:t>
-      </w:r>
-      <w:proofErr w:type="spellEnd"/>
-      <w:r>
-        <w:t>;</w:t>
-      </w:r>
-      <w:r>
-        <w:t xml:space="preserve"> </w:t>
-      </w:r>
-      <w:proofErr w:type="spellStart"/>
-      <w:r>
-        <w:t>Answer</w:t>
-      </w:r>
-      <w:proofErr w:type="spellEnd"/>
-      <w:r>
-        <w:t xml:space="preserve"> the 4 </w:t>
-      </w:r>
-      <w:proofErr w:type="spellStart"/>
-      <w:r>
-        <w:t>questions</w:t>
-      </w:r>
-      <w:proofErr w:type="spellEnd"/>
-      <w:r>
-        <w:t xml:space="preserve"> </w:t>
-      </w:r>
-      <w:proofErr w:type="spellStart"/>
-      <w:r>
-        <w:t>above</w:t>
-      </w:r>
-      <w:proofErr w:type="spellEnd"/>
-      <w:r>
-        <w:t xml:space="preserve"> for </w:t>
-      </w:r>
-      <w:proofErr w:type="spellStart"/>
-      <w:r>
-        <w:t>these</w:t>
-      </w:r>
-      <w:proofErr w:type="spellEnd"/>
-      <w:r>
-        <w:t xml:space="preserve"> </w:t>
-      </w:r>
-      <w:proofErr w:type="spellStart"/>
-      <w:r>
-        <w:t>papers</w:t>
-      </w:r>
-      <w:proofErr w:type="spellEnd"/>
-      <w:r>
-        <w:t xml:space="preserve"> and </w:t>
-      </w:r>
-      <w:proofErr w:type="spellStart"/>
-      <w:r>
-        <w:t>dissertations</w:t>
+        <w:t xml:space="preserve"> </w:t>
+      </w:r>
+      <w:proofErr w:type="spellStart"/>
+      <w:r>
+        <w:t>gaps</w:t>
       </w:r>
       <w:proofErr w:type="spellEnd"/>
       <w:r>
         <w:t xml:space="preserve">. </w:t>
-      </w:r>
-      <w:r>
-        <w:t xml:space="preserve"> </w:t>
       </w:r>
     </w:p>
     <w:p>
       <w:r>
-        <w:t xml:space="preserve">Mein Arbeitstitel von meinem Einstellungsvertrag heißt ja: „Novel Ab Initio </w:t>
-      </w:r>
-      <w:proofErr w:type="spellStart"/>
-      <w:r>
-        <w:t>Methodology</w:t>
-      </w:r>
-      <w:proofErr w:type="spellEnd"/>
-      <w:r>
-        <w:t xml:space="preserve"> for Trions and </w:t>
-      </w:r>
-      <w:proofErr w:type="spellStart"/>
-      <w:r>
-        <w:t>Biexcitons</w:t>
-      </w:r>
-      <w:proofErr w:type="spellEnd"/>
-      <w:r>
-        <w:t xml:space="preserve"> in Moiré and 2D Janus </w:t>
-      </w:r>
-      <w:proofErr w:type="spellStart"/>
-      <w:r>
-        <w:t>materials</w:t>
-      </w:r>
-      <w:proofErr w:type="spellEnd"/>
-      <w:r>
-        <w:t xml:space="preserve">“. Habt ihr da schon konkrete Ideen, welche Art von </w:t>
-      </w:r>
-      <w:proofErr w:type="spellStart"/>
-      <w:r>
-        <w:t>Methology</w:t>
-      </w:r>
-      <w:proofErr w:type="spellEnd"/>
-      <w:r>
-        <w:t xml:space="preserve"> ich und wir für diese entwickeln wollen? Und welche in anderen 2D Systemen und </w:t>
-      </w:r>
-      <w:proofErr w:type="spellStart"/>
-      <w:r>
-        <w:t>mglw</w:t>
+        <w:t xml:space="preserve">Read </w:t>
+      </w:r>
+      <w:proofErr w:type="spellStart"/>
+      <w:r>
+        <w:t>dissertation</w:t>
+      </w:r>
+      <w:proofErr w:type="spellEnd"/>
+      <w:r>
+        <w:t xml:space="preserve"> „</w:t>
+      </w:r>
+      <w:proofErr w:type="spellStart"/>
+      <w:r>
+        <w:t>Exzitons</w:t>
+      </w:r>
+      <w:proofErr w:type="spellEnd"/>
+      <w:r>
+        <w:t xml:space="preserve"> in mono and </w:t>
+      </w:r>
+      <w:proofErr w:type="spellStart"/>
+      <w:r>
+        <w:t>bilayers</w:t>
+      </w:r>
+      <w:proofErr w:type="spellEnd"/>
+      <w:r>
+        <w:t xml:space="preserve"> of TMDs“ </w:t>
+      </w:r>
+      <w:proofErr w:type="spellStart"/>
+      <w:r>
+        <w:t>from</w:t>
+      </w:r>
+      <w:proofErr w:type="spellEnd"/>
+      <w:r>
+        <w:t xml:space="preserve"> Malte Kremser (TUM) and </w:t>
+      </w:r>
+      <w:proofErr w:type="spellStart"/>
+      <w:r>
+        <w:t>search</w:t>
+      </w:r>
+      <w:proofErr w:type="spellEnd"/>
+      <w:r>
+        <w:t xml:space="preserve"> for open </w:t>
+      </w:r>
+      <w:proofErr w:type="spellStart"/>
+      <w:r>
+        <w:t>scientific</w:t>
+      </w:r>
+      <w:proofErr w:type="spellEnd"/>
+      <w:r>
+        <w:t xml:space="preserve"> </w:t>
+      </w:r>
+      <w:proofErr w:type="spellStart"/>
+      <w:r>
+        <w:t>questions</w:t>
+      </w:r>
+      <w:proofErr w:type="spellEnd"/>
+      <w:r>
+        <w:t xml:space="preserve"> and </w:t>
+      </w:r>
+      <w:proofErr w:type="spellStart"/>
+      <w:r>
+        <w:t>what</w:t>
+      </w:r>
+      <w:proofErr w:type="spellEnd"/>
+      <w:r>
+        <w:t xml:space="preserve"> he </w:t>
+      </w:r>
+      <w:proofErr w:type="spellStart"/>
+      <w:r>
+        <w:t>researched</w:t>
+      </w:r>
+      <w:proofErr w:type="spellEnd"/>
+      <w:r>
+        <w:t xml:space="preserve"> </w:t>
+      </w:r>
+      <w:proofErr w:type="spellStart"/>
+      <w:r>
+        <w:t>about</w:t>
+      </w:r>
+      <w:proofErr w:type="spellEnd"/>
+      <w:r>
+        <w:t xml:space="preserve"> Moiré </w:t>
+      </w:r>
+      <w:proofErr w:type="spellStart"/>
+      <w:proofErr w:type="gramStart"/>
+      <w:r>
+        <w:t>exzitons</w:t>
+      </w:r>
+      <w:proofErr w:type="spellEnd"/>
+      <w:r>
+        <w:t xml:space="preserve">;  </w:t>
+      </w:r>
+      <w:r>
+        <w:t>And</w:t>
+      </w:r>
+      <w:proofErr w:type="gramEnd"/>
+      <w:r>
+        <w:t xml:space="preserve"> also </w:t>
+      </w:r>
+      <w:proofErr w:type="spellStart"/>
+      <w:r>
+        <w:t>read</w:t>
+      </w:r>
+      <w:proofErr w:type="spellEnd"/>
+      <w:r>
+        <w:t xml:space="preserve"> and </w:t>
+      </w:r>
+      <w:proofErr w:type="spellStart"/>
+      <w:r>
+        <w:t>understand</w:t>
+      </w:r>
+      <w:proofErr w:type="spellEnd"/>
+      <w:r>
+        <w:t xml:space="preserve"> in </w:t>
+      </w:r>
+      <w:proofErr w:type="spellStart"/>
+      <w:r>
+        <w:t>detail</w:t>
+      </w:r>
+      <w:proofErr w:type="spellEnd"/>
+      <w:r>
+        <w:t xml:space="preserve"> </w:t>
+      </w:r>
+      <w:proofErr w:type="spellStart"/>
+      <w:r>
+        <w:t>his</w:t>
+      </w:r>
+      <w:proofErr w:type="spellEnd"/>
+      <w:r>
+        <w:t xml:space="preserve"> </w:t>
+      </w:r>
+      <w:proofErr w:type="spellStart"/>
+      <w:r>
+        <w:t>paper</w:t>
+      </w:r>
+      <w:proofErr w:type="spellEnd"/>
+      <w:r>
+        <w:t xml:space="preserve">: </w:t>
+      </w:r>
+      <w:r>
+        <w:t>Twist-</w:t>
+      </w:r>
+      <w:proofErr w:type="spellStart"/>
+      <w:r>
+        <w:t>Dependent</w:t>
+      </w:r>
+      <w:proofErr w:type="spellEnd"/>
+      <w:r>
+        <w:t xml:space="preserve"> Intra- and </w:t>
+      </w:r>
+      <w:proofErr w:type="spellStart"/>
+      <w:r>
+        <w:t>Interlayer</w:t>
+      </w:r>
+      <w:proofErr w:type="spellEnd"/>
+      <w:r>
+        <w:t xml:space="preserve"> </w:t>
+      </w:r>
+      <w:proofErr w:type="spellStart"/>
+      <w:r>
+        <w:t>Excitons</w:t>
+      </w:r>
+      <w:proofErr w:type="spellEnd"/>
+      <w:r>
+        <w:t xml:space="preserve"> in </w:t>
+      </w:r>
+      <w:proofErr w:type="spellStart"/>
+      <w:r>
+        <w:t>Moir´e</w:t>
+      </w:r>
+      <w:proofErr w:type="spellEnd"/>
+      <w:r>
+        <w:t xml:space="preserve"> MoSe2 </w:t>
+      </w:r>
+      <w:proofErr w:type="spellStart"/>
+      <w:r>
+        <w:t>Homobilayers</w:t>
+      </w:r>
+      <w:proofErr w:type="spellEnd"/>
+      <w:r>
+        <w:t>;</w:t>
+      </w:r>
+      <w:r>
+        <w:t xml:space="preserve"> </w:t>
+      </w:r>
+      <w:proofErr w:type="spellStart"/>
+      <w:r>
+        <w:t>Answer</w:t>
+      </w:r>
+      <w:proofErr w:type="spellEnd"/>
+      <w:r>
+        <w:t xml:space="preserve"> the 4 </w:t>
+      </w:r>
+      <w:proofErr w:type="spellStart"/>
+      <w:r>
+        <w:t>questions</w:t>
+      </w:r>
+      <w:proofErr w:type="spellEnd"/>
+      <w:r>
+        <w:t xml:space="preserve"> </w:t>
+      </w:r>
+      <w:proofErr w:type="spellStart"/>
+      <w:r>
+        <w:t>above</w:t>
+      </w:r>
+      <w:proofErr w:type="spellEnd"/>
+      <w:r>
+        <w:t xml:space="preserve"> for </w:t>
+      </w:r>
+      <w:proofErr w:type="spellStart"/>
+      <w:r>
+        <w:t>these</w:t>
+      </w:r>
+      <w:proofErr w:type="spellEnd"/>
+      <w:r>
+        <w:t xml:space="preserve"> </w:t>
+      </w:r>
+      <w:proofErr w:type="spellStart"/>
+      <w:r>
+        <w:t>papers</w:t>
+      </w:r>
+      <w:proofErr w:type="spellEnd"/>
+      <w:r>
+        <w:t xml:space="preserve"> and </w:t>
+      </w:r>
+      <w:proofErr w:type="spellStart"/>
+      <w:r>
+        <w:t>dissertations</w:t>
       </w:r>
       <w:proofErr w:type="spellEnd"/>
       <w:r>
         <w:t xml:space="preserve">. </w:t>
       </w:r>
-      <w:proofErr w:type="spellStart"/>
-      <w:r>
-        <w:t>Exzitonenarten</w:t>
-      </w:r>
-      <w:proofErr w:type="spellEnd"/>
-      <w:r>
-        <w:t xml:space="preserve"> schon gut funktioniert hat, aber für Trions and </w:t>
-      </w:r>
-      <w:proofErr w:type="spellStart"/>
-      <w:r>
-        <w:t>Biexcitons</w:t>
-      </w:r>
-      <w:proofErr w:type="spellEnd"/>
-      <w:r>
-        <w:t xml:space="preserve"> in Moiré und Janus 2D </w:t>
-      </w:r>
-      <w:proofErr w:type="spellStart"/>
-      <w:r>
-        <w:t>materials</w:t>
-      </w:r>
-      <w:proofErr w:type="spellEnd"/>
-      <w:r>
-        <w:t xml:space="preserve"> noch nicht angewandt wurde? </w:t>
+      <w:r>
+        <w:t xml:space="preserve"> </w:t>
       </w:r>
     </w:p>
     <w:p>
       <w:r>
+        <w:t xml:space="preserve">Mein Arbeitstitel von meinem Einstellungsvertrag heißt ja: „Novel Ab Initio </w:t>
+      </w:r>
+      <w:proofErr w:type="spellStart"/>
+      <w:r>
+        <w:t>Methodology</w:t>
+      </w:r>
+      <w:proofErr w:type="spellEnd"/>
+      <w:r>
+        <w:t xml:space="preserve"> for Trions and </w:t>
+      </w:r>
+      <w:proofErr w:type="spellStart"/>
+      <w:r>
+        <w:t>Biexcitons</w:t>
+      </w:r>
+      <w:proofErr w:type="spellEnd"/>
+      <w:r>
+        <w:t xml:space="preserve"> in Moiré and 2D Janus </w:t>
+      </w:r>
+      <w:proofErr w:type="spellStart"/>
+      <w:r>
+        <w:t>materials</w:t>
+      </w:r>
+      <w:proofErr w:type="spellEnd"/>
+      <w:r>
+        <w:t xml:space="preserve">“. Habt ihr da schon konkrete Ideen, welche Art von </w:t>
+      </w:r>
+      <w:proofErr w:type="spellStart"/>
+      <w:r>
+        <w:t>Methology</w:t>
+      </w:r>
+      <w:proofErr w:type="spellEnd"/>
+      <w:r>
+        <w:t xml:space="preserve"> ich und wir für diese entwickeln wollen? Und welche in anderen 2D Systemen und </w:t>
+      </w:r>
+      <w:proofErr w:type="spellStart"/>
+      <w:r>
+        <w:t>mglw</w:t>
+      </w:r>
+      <w:proofErr w:type="spellEnd"/>
+      <w:r>
+        <w:t xml:space="preserve">. </w:t>
+      </w:r>
+      <w:proofErr w:type="spellStart"/>
+      <w:r>
+        <w:t>Exzitonenarten</w:t>
+      </w:r>
+      <w:proofErr w:type="spellEnd"/>
+      <w:r>
+        <w:t xml:space="preserve"> schon gut funktioniert hat, aber für Trions and </w:t>
+      </w:r>
+      <w:proofErr w:type="spellStart"/>
+      <w:r>
+        <w:t>Biexcitons</w:t>
+      </w:r>
+      <w:proofErr w:type="spellEnd"/>
+      <w:r>
+        <w:t xml:space="preserve"> in Moiré und Janus 2D </w:t>
+      </w:r>
+      <w:proofErr w:type="spellStart"/>
+      <w:r>
+        <w:t>materials</w:t>
+      </w:r>
+      <w:proofErr w:type="spellEnd"/>
+      <w:r>
+        <w:t xml:space="preserve"> noch nicht angewandt wurde? </w:t>
+      </w:r>
+    </w:p>
+    <w:p>
+      <w:r>
         <w:t xml:space="preserve">Im </w:t>
       </w:r>
       <w:proofErr w:type="spellStart"/>
@@ -687,7 +775,165 @@
         <w:t xml:space="preserve"> Techniken referenziert. Dieses kannst du als Ausgangspunkt nehmen, um diese zu studieren und passende zu finden. </w:t>
       </w:r>
     </w:p>
-    <w:p/>
+    <w:p>
+      <w:r>
+        <w:rPr>
+          <w:b/>
+          <w:bCs/>
+        </w:rPr>
+        <w:t xml:space="preserve">Hauptsächlich sollst du einen eigenen Code entwickeln, um gut </w:t>
+      </w:r>
+      <w:r>
+        <w:rPr>
+          <w:b/>
+          <w:bCs/>
+        </w:rPr>
+        <w:t xml:space="preserve">TMD </w:t>
+      </w:r>
+      <w:r>
+        <w:rPr>
+          <w:b/>
+          <w:bCs/>
+        </w:rPr>
+        <w:t>Moiré Materialien berechnen zu können.</w:t>
+      </w:r>
+      <w:r>
+        <w:t xml:space="preserve"> Was wohl sehr rechenintensiv ist. </w:t>
+      </w:r>
+    </w:p>
+    <w:p>
+      <w:r>
+        <w:t xml:space="preserve">Strategie dafür: Schauen wie vor allem </w:t>
+      </w:r>
+      <w:proofErr w:type="spellStart"/>
+      <w:r>
+        <w:t>twisted</w:t>
+      </w:r>
+      <w:proofErr w:type="spellEnd"/>
+      <w:r>
+        <w:t xml:space="preserve"> </w:t>
+      </w:r>
+      <w:proofErr w:type="spellStart"/>
+      <w:r>
+        <w:t>bilayer</w:t>
+      </w:r>
+      <w:proofErr w:type="spellEnd"/>
+      <w:r>
+        <w:t xml:space="preserve"> </w:t>
+      </w:r>
+      <w:proofErr w:type="spellStart"/>
+      <w:r>
+        <w:t>graphene</w:t>
+      </w:r>
+      <w:proofErr w:type="spellEnd"/>
+      <w:r>
+        <w:t xml:space="preserve"> bisher modelliert wird und schauen, ob du ähnliches angepasst auch auf </w:t>
+      </w:r>
+      <w:proofErr w:type="spellStart"/>
+      <w:r>
+        <w:t>twisted</w:t>
+      </w:r>
+      <w:proofErr w:type="spellEnd"/>
+      <w:r>
+        <w:t xml:space="preserve"> TMDs anwenden kannst. Dies geht vor allem über das </w:t>
+      </w:r>
+      <w:proofErr w:type="spellStart"/>
+      <w:r>
+        <w:t>paper</w:t>
+      </w:r>
+      <w:proofErr w:type="spellEnd"/>
+      <w:r>
+        <w:t xml:space="preserve"> „</w:t>
+      </w:r>
+      <w:proofErr w:type="spellStart"/>
+      <w:r>
+        <w:t>twisted</w:t>
+      </w:r>
+      <w:proofErr w:type="spellEnd"/>
+      <w:r>
+        <w:t xml:space="preserve"> </w:t>
+      </w:r>
+      <w:proofErr w:type="spellStart"/>
+      <w:r>
+        <w:t>bilayer</w:t>
+      </w:r>
+      <w:proofErr w:type="spellEnd"/>
+      <w:r>
+        <w:t xml:space="preserve"> </w:t>
+      </w:r>
+      <w:proofErr w:type="spellStart"/>
+      <w:r>
+        <w:t>graphene</w:t>
+      </w:r>
+      <w:proofErr w:type="spellEnd"/>
+      <w:r>
+        <w:t xml:space="preserve"> </w:t>
+      </w:r>
+      <w:proofErr w:type="spellStart"/>
+      <w:r>
+        <w:t>from</w:t>
+      </w:r>
+      <w:proofErr w:type="spellEnd"/>
+      <w:r>
+        <w:t xml:space="preserve"> </w:t>
+      </w:r>
+      <w:proofErr w:type="spellStart"/>
+      <w:r>
+        <w:t>first</w:t>
+      </w:r>
+      <w:proofErr w:type="spellEnd"/>
+      <w:r>
+        <w:t xml:space="preserve"> </w:t>
+      </w:r>
+      <w:proofErr w:type="spellStart"/>
+      <w:r>
+        <w:t>principles</w:t>
+      </w:r>
+      <w:proofErr w:type="spellEnd"/>
+      <w:r>
+        <w:t xml:space="preserve">: </w:t>
+      </w:r>
+      <w:proofErr w:type="spellStart"/>
+      <w:r>
+        <w:t>structural</w:t>
+      </w:r>
+      <w:proofErr w:type="spellEnd"/>
+      <w:r>
+        <w:t xml:space="preserve"> and electronic </w:t>
+      </w:r>
+      <w:proofErr w:type="spellStart"/>
+      <w:r>
+        <w:t>properties</w:t>
+      </w:r>
+      <w:proofErr w:type="spellEnd"/>
+      <w:r>
+        <w:t xml:space="preserve">“ von Albert Zhu et al. In PRB (2026). Sie nutzen ein </w:t>
+      </w:r>
+      <w:proofErr w:type="spellStart"/>
+      <w:r>
+        <w:t>optimierstes</w:t>
+      </w:r>
+      <w:proofErr w:type="spellEnd"/>
+      <w:r>
+        <w:t xml:space="preserve"> </w:t>
+      </w:r>
+      <w:proofErr w:type="spellStart"/>
+      <w:r>
+        <w:t>basis</w:t>
+      </w:r>
+      <w:proofErr w:type="spellEnd"/>
+      <w:r>
+        <w:t xml:space="preserve"> </w:t>
+      </w:r>
+      <w:proofErr w:type="spellStart"/>
+      <w:r>
+        <w:t>set</w:t>
+      </w:r>
+      <w:proofErr w:type="spellEnd"/>
+      <w:r>
+        <w:t xml:space="preserve">. </w:t>
+      </w:r>
+    </w:p>
     <w:p>
       <w:pPr>
         <w:rPr>

</xml_diff>